<commit_message>
Dernière Version Document Cadrage
</commit_message>
<xml_diff>
--- a/DOCUMENT DE CADRAGE FINAL.docx
+++ b/DOCUMENT DE CADRAGE FINAL.docx
@@ -228,7 +228,6 @@
           <w:szCs w:val="24"/>
         </w:rPr>
       </w:pPr>
-      <w:proofErr w:type="spellStart"/>
       <w:r>
         <w:rPr>
           <w:rFonts w:ascii="Aptos" w:hAnsi="Aptos"/>
@@ -237,26 +236,31 @@
           <w:sz w:val="24"/>
           <w:szCs w:val="24"/>
         </w:rPr>
-        <w:t>Khadiatou</w:t>
-      </w:r>
-      <w:proofErr w:type="spellEnd"/>
-      <w:r>
-        <w:rPr>
-          <w:rFonts w:ascii="Aptos" w:hAnsi="Aptos"/>
-          <w:b/>
-          <w:bCs/>
-          <w:sz w:val="24"/>
-          <w:szCs w:val="24"/>
-        </w:rPr>
-        <w:t xml:space="preserve"> :</w:t>
-      </w:r>
-      <w:r>
-        <w:rPr>
-          <w:rFonts w:ascii="Aptos" w:hAnsi="Aptos"/>
-          <w:sz w:val="24"/>
-          <w:szCs w:val="24"/>
-        </w:rPr>
-        <w:t xml:space="preserve"> Responsable Documentation &amp; Qualité.</w:t>
+        <w:t>Khadiatou :</w:t>
+      </w:r>
+      <w:r>
+        <w:rPr>
+          <w:rFonts w:ascii="Aptos" w:hAnsi="Aptos"/>
+          <w:sz w:val="24"/>
+          <w:szCs w:val="24"/>
+        </w:rPr>
+        <w:t xml:space="preserve"> </w:t>
+      </w:r>
+      <w:r>
+        <w:rPr>
+          <w:rFonts w:ascii="Aptos" w:hAnsi="Aptos"/>
+          <w:sz w:val="24"/>
+          <w:szCs w:val="24"/>
+        </w:rPr>
+        <w:t>Responsable Documentation &amp; Déploiement Applicatif (Docker)</w:t>
+      </w:r>
+      <w:r>
+        <w:rPr>
+          <w:rFonts w:ascii="Aptos" w:hAnsi="Aptos"/>
+          <w:sz w:val="24"/>
+          <w:szCs w:val="24"/>
+        </w:rPr>
+        <w:t>.</w:t>
       </w:r>
     </w:p>
     <w:p>
@@ -5064,6 +5068,150 @@
         <w:t>Afin d'offrir une vision claire de notre environnement technique, voici le tableau récapitulatif des serveurs déployés :</w:t>
       </w:r>
     </w:p>
+    <w:p>
+      <w:pPr>
+        <w:pStyle w:val="NormalWeb"/>
+        <w:spacing w:before="0" w:beforeAutospacing="0"/>
+        <w:jc w:val="both"/>
+        <w:rPr>
+          <w:rFonts w:ascii="Aptos" w:hAnsi="Aptos" w:cs="Arial"/>
+          <w:sz w:val="24"/>
+          <w:szCs w:val="24"/>
+        </w:rPr>
+      </w:pPr>
+    </w:p>
+    <w:p>
+      <w:pPr>
+        <w:pStyle w:val="NormalWeb"/>
+        <w:spacing w:before="0" w:beforeAutospacing="0"/>
+        <w:jc w:val="both"/>
+        <w:rPr>
+          <w:rFonts w:ascii="Aptos" w:hAnsi="Aptos" w:cs="Arial"/>
+          <w:sz w:val="24"/>
+          <w:szCs w:val="24"/>
+        </w:rPr>
+      </w:pPr>
+    </w:p>
+    <w:p>
+      <w:pPr>
+        <w:pStyle w:val="NormalWeb"/>
+        <w:spacing w:before="0" w:beforeAutospacing="0"/>
+        <w:jc w:val="both"/>
+        <w:rPr>
+          <w:rFonts w:ascii="Aptos" w:hAnsi="Aptos" w:cs="Arial"/>
+          <w:sz w:val="24"/>
+          <w:szCs w:val="24"/>
+        </w:rPr>
+      </w:pPr>
+    </w:p>
+    <w:p>
+      <w:pPr>
+        <w:pStyle w:val="NormalWeb"/>
+        <w:spacing w:before="0" w:beforeAutospacing="0"/>
+        <w:jc w:val="both"/>
+        <w:rPr>
+          <w:rFonts w:ascii="Aptos" w:hAnsi="Aptos" w:cs="Arial"/>
+          <w:sz w:val="24"/>
+          <w:szCs w:val="24"/>
+        </w:rPr>
+      </w:pPr>
+    </w:p>
+    <w:p>
+      <w:pPr>
+        <w:pStyle w:val="NormalWeb"/>
+        <w:spacing w:before="0" w:beforeAutospacing="0"/>
+        <w:jc w:val="both"/>
+        <w:rPr>
+          <w:rFonts w:ascii="Aptos" w:hAnsi="Aptos" w:cs="Arial"/>
+          <w:sz w:val="24"/>
+          <w:szCs w:val="24"/>
+        </w:rPr>
+      </w:pPr>
+    </w:p>
+    <w:p>
+      <w:pPr>
+        <w:pStyle w:val="NormalWeb"/>
+        <w:spacing w:before="0" w:beforeAutospacing="0"/>
+        <w:jc w:val="both"/>
+        <w:rPr>
+          <w:rFonts w:ascii="Aptos" w:hAnsi="Aptos" w:cs="Arial"/>
+          <w:sz w:val="24"/>
+          <w:szCs w:val="24"/>
+        </w:rPr>
+      </w:pPr>
+    </w:p>
+    <w:p>
+      <w:pPr>
+        <w:pStyle w:val="NormalWeb"/>
+        <w:spacing w:before="0" w:beforeAutospacing="0"/>
+        <w:jc w:val="both"/>
+        <w:rPr>
+          <w:rFonts w:ascii="Aptos" w:hAnsi="Aptos" w:cs="Arial"/>
+          <w:sz w:val="24"/>
+          <w:szCs w:val="24"/>
+        </w:rPr>
+      </w:pPr>
+    </w:p>
+    <w:p>
+      <w:pPr>
+        <w:pStyle w:val="NormalWeb"/>
+        <w:spacing w:before="0" w:beforeAutospacing="0"/>
+        <w:jc w:val="both"/>
+        <w:rPr>
+          <w:rFonts w:ascii="Aptos" w:hAnsi="Aptos" w:cs="Arial"/>
+          <w:sz w:val="24"/>
+          <w:szCs w:val="24"/>
+        </w:rPr>
+      </w:pPr>
+    </w:p>
+    <w:p>
+      <w:pPr>
+        <w:pStyle w:val="NormalWeb"/>
+        <w:spacing w:before="0" w:beforeAutospacing="0"/>
+        <w:jc w:val="both"/>
+        <w:rPr>
+          <w:rFonts w:ascii="Aptos" w:hAnsi="Aptos" w:cs="Arial"/>
+          <w:sz w:val="24"/>
+          <w:szCs w:val="24"/>
+        </w:rPr>
+      </w:pPr>
+    </w:p>
+    <w:p>
+      <w:pPr>
+        <w:pStyle w:val="NormalWeb"/>
+        <w:spacing w:before="0" w:beforeAutospacing="0"/>
+        <w:jc w:val="both"/>
+        <w:rPr>
+          <w:rFonts w:ascii="Aptos" w:hAnsi="Aptos" w:cs="Arial"/>
+          <w:sz w:val="24"/>
+          <w:szCs w:val="24"/>
+        </w:rPr>
+      </w:pPr>
+    </w:p>
+    <w:p>
+      <w:pPr>
+        <w:pStyle w:val="NormalWeb"/>
+        <w:spacing w:before="0" w:beforeAutospacing="0"/>
+        <w:jc w:val="both"/>
+        <w:rPr>
+          <w:rFonts w:ascii="Aptos" w:hAnsi="Aptos" w:cs="Arial"/>
+          <w:sz w:val="24"/>
+          <w:szCs w:val="24"/>
+        </w:rPr>
+      </w:pPr>
+    </w:p>
+    <w:p>
+      <w:pPr>
+        <w:pStyle w:val="NormalWeb"/>
+        <w:spacing w:before="0" w:beforeAutospacing="0"/>
+        <w:jc w:val="both"/>
+        <w:rPr>
+          <w:rFonts w:ascii="Aptos" w:hAnsi="Aptos" w:cs="Arial"/>
+          <w:sz w:val="24"/>
+          <w:szCs w:val="24"/>
+        </w:rPr>
+      </w:pPr>
+    </w:p>
     <w:tbl>
       <w:tblPr>
         <w:tblStyle w:val="Grilledutableau"/>
@@ -5106,6 +5254,7 @@
                 <w:sz w:val="24"/>
                 <w:szCs w:val="24"/>
               </w:rPr>
+              <w:lastRenderedPageBreak/>
               <w:t>Nom du Serveur</w:t>
             </w:r>
           </w:p>
@@ -5302,7 +5451,6 @@
             <w:pPr>
               <w:pStyle w:val="NormalWeb"/>
               <w:spacing w:before="0" w:beforeAutospacing="0"/>
-              <w:jc w:val="both"/>
               <w:rPr>
                 <w:rFonts w:ascii="Aptos" w:hAnsi="Aptos" w:cs="Arial"/>
                 <w:sz w:val="24"/>
@@ -5436,7 +5584,6 @@
             <w:pPr>
               <w:pStyle w:val="NormalWeb"/>
               <w:spacing w:before="0" w:beforeAutospacing="0"/>
-              <w:jc w:val="both"/>
               <w:rPr>
                 <w:rFonts w:ascii="Aptos" w:hAnsi="Aptos" w:cs="Arial"/>
                 <w:sz w:val="24"/>
@@ -5491,7 +5638,6 @@
                 <w:sz w:val="24"/>
                 <w:szCs w:val="24"/>
               </w:rPr>
-              <w:lastRenderedPageBreak/>
               <w:t>CLIENT01</w:t>
             </w:r>
           </w:p>
@@ -5564,6 +5710,7 @@
           <w:sz w:val="24"/>
           <w:szCs w:val="24"/>
         </w:rPr>
+        <w:lastRenderedPageBreak/>
         <w:t>Cette organisation rigoureuse nous permet de reproduire fidèlement une infrastructure d'entreprise réelle et professionnelle. Chaque machine a été dimensionnée pour répondre aux besoins spécifiques de CYNA tout en conservant une marge d'évolution</w:t>
       </w:r>
     </w:p>
@@ -5860,7 +6007,6 @@
           <w:sz w:val="24"/>
           <w:szCs w:val="24"/>
         </w:rPr>
-        <w:lastRenderedPageBreak/>
         <w:t>Application des stratégies de sécurité (GPO)</w:t>
       </w:r>
       <w:r>
@@ -9184,7 +9330,6 @@
           <w:szCs w:val="24"/>
           <w:lang w:eastAsia="fr-FR"/>
         </w:rPr>
-        <w:lastRenderedPageBreak/>
         <w:t>Gestion de la flotte via Microsoft Intune</w:t>
       </w:r>
       <w:bookmarkEnd w:id="17"/>
@@ -9509,7 +9654,6 @@
           </w:tcPr>
           <w:p>
             <w:pPr>
-              <w:jc w:val="both"/>
               <w:rPr>
                 <w:rFonts w:ascii="Aptos" w:hAnsi="Aptos"/>
                 <w:sz w:val="24"/>
@@ -9545,7 +9689,6 @@
           </w:tcPr>
           <w:p>
             <w:pPr>
-              <w:jc w:val="both"/>
               <w:rPr>
                 <w:rFonts w:ascii="Aptos" w:hAnsi="Aptos"/>
                 <w:sz w:val="24"/>
@@ -9600,7 +9743,6 @@
           </w:tcPr>
           <w:p>
             <w:pPr>
-              <w:jc w:val="both"/>
               <w:rPr>
                 <w:rFonts w:ascii="Aptos" w:hAnsi="Aptos"/>
                 <w:sz w:val="24"/>
@@ -9636,7 +9778,6 @@
           </w:tcPr>
           <w:p>
             <w:pPr>
-              <w:jc w:val="both"/>
               <w:rPr>
                 <w:rFonts w:ascii="Aptos" w:hAnsi="Aptos"/>
                 <w:sz w:val="24"/>
@@ -9727,7 +9868,6 @@
           </w:tcPr>
           <w:p>
             <w:pPr>
-              <w:jc w:val="both"/>
               <w:rPr>
                 <w:rFonts w:ascii="Aptos" w:hAnsi="Aptos"/>
                 <w:sz w:val="24"/>
@@ -11035,6 +11175,7 @@
       <w:r>
         <w:rPr>
           <w:rFonts w:ascii="Aptos" w:hAnsi="Aptos"/>
+          <w:noProof/>
           <w:sz w:val="24"/>
           <w:szCs w:val="24"/>
         </w:rPr>
@@ -11266,7 +11407,6 @@
           </w:tcPr>
           <w:p>
             <w:pPr>
-              <w:jc w:val="both"/>
               <w:rPr>
                 <w:rFonts w:ascii="Aptos" w:hAnsi="Aptos"/>
                 <w:sz w:val="24"/>
@@ -11341,7 +11481,6 @@
           </w:tcPr>
           <w:p>
             <w:pPr>
-              <w:jc w:val="both"/>
               <w:rPr>
                 <w:rFonts w:ascii="Aptos" w:hAnsi="Aptos"/>
                 <w:sz w:val="24"/>
@@ -11415,7 +11554,6 @@
           </w:tcPr>
           <w:p>
             <w:pPr>
-              <w:jc w:val="both"/>
               <w:rPr>
                 <w:rFonts w:ascii="Aptos" w:hAnsi="Aptos"/>
                 <w:sz w:val="24"/>
@@ -13422,7 +13560,6 @@
           </w:tcPr>
           <w:p>
             <w:pPr>
-              <w:jc w:val="both"/>
               <w:rPr>
                 <w:rFonts w:ascii="Aptos" w:hAnsi="Aptos"/>
                 <w:sz w:val="24"/>
@@ -13445,7 +13582,6 @@
           </w:tcPr>
           <w:p>
             <w:pPr>
-              <w:jc w:val="both"/>
               <w:rPr>
                 <w:rFonts w:ascii="Aptos" w:hAnsi="Aptos"/>
                 <w:sz w:val="24"/>
@@ -13496,7 +13632,6 @@
           </w:tcPr>
           <w:p>
             <w:pPr>
-              <w:jc w:val="both"/>
               <w:rPr>
                 <w:rFonts w:ascii="Aptos" w:hAnsi="Aptos"/>
                 <w:sz w:val="24"/>
@@ -13519,7 +13654,6 @@
           </w:tcPr>
           <w:p>
             <w:pPr>
-              <w:jc w:val="both"/>
               <w:rPr>
                 <w:rFonts w:ascii="Aptos" w:hAnsi="Aptos"/>
                 <w:sz w:val="24"/>
@@ -13570,7 +13704,6 @@
           </w:tcPr>
           <w:p>
             <w:pPr>
-              <w:jc w:val="both"/>
               <w:rPr>
                 <w:rFonts w:ascii="Aptos" w:hAnsi="Aptos"/>
                 <w:sz w:val="24"/>
@@ -13593,7 +13726,6 @@
           </w:tcPr>
           <w:p>
             <w:pPr>
-              <w:jc w:val="both"/>
               <w:rPr>
                 <w:rFonts w:ascii="Aptos" w:hAnsi="Aptos"/>
                 <w:sz w:val="24"/>
@@ -14142,7 +14274,6 @@
           </w:tcPr>
           <w:p>
             <w:pPr>
-              <w:jc w:val="both"/>
               <w:rPr>
                 <w:rFonts w:ascii="Aptos" w:hAnsi="Aptos"/>
                 <w:sz w:val="24"/>
@@ -14165,7 +14296,6 @@
           </w:tcPr>
           <w:p>
             <w:pPr>
-              <w:jc w:val="both"/>
               <w:rPr>
                 <w:rFonts w:ascii="Aptos" w:hAnsi="Aptos"/>
                 <w:sz w:val="24"/>
@@ -14216,7 +14346,6 @@
           </w:tcPr>
           <w:p>
             <w:pPr>
-              <w:jc w:val="both"/>
               <w:rPr>
                 <w:rFonts w:ascii="Aptos" w:hAnsi="Aptos"/>
                 <w:sz w:val="24"/>
@@ -14239,7 +14368,6 @@
           </w:tcPr>
           <w:p>
             <w:pPr>
-              <w:jc w:val="both"/>
               <w:rPr>
                 <w:rFonts w:ascii="Aptos" w:hAnsi="Aptos"/>
                 <w:sz w:val="24"/>
@@ -14290,7 +14418,6 @@
           </w:tcPr>
           <w:p>
             <w:pPr>
-              <w:jc w:val="both"/>
               <w:rPr>
                 <w:rFonts w:ascii="Aptos" w:hAnsi="Aptos"/>
                 <w:sz w:val="24"/>
@@ -14313,7 +14440,6 @@
           </w:tcPr>
           <w:p>
             <w:pPr>
-              <w:jc w:val="both"/>
               <w:rPr>
                 <w:rFonts w:ascii="Aptos" w:hAnsi="Aptos"/>
                 <w:sz w:val="24"/>
@@ -14869,7 +14995,6 @@
           </w:tcPr>
           <w:p>
             <w:pPr>
-              <w:jc w:val="both"/>
               <w:rPr>
                 <w:rFonts w:ascii="Aptos" w:hAnsi="Aptos"/>
                 <w:sz w:val="24"/>
@@ -14943,7 +15068,6 @@
           </w:tcPr>
           <w:p>
             <w:pPr>
-              <w:jc w:val="both"/>
               <w:rPr>
                 <w:rFonts w:ascii="Aptos" w:hAnsi="Aptos"/>
                 <w:sz w:val="24"/>
@@ -15017,7 +15141,6 @@
           </w:tcPr>
           <w:p>
             <w:pPr>
-              <w:jc w:val="both"/>
               <w:rPr>
                 <w:rFonts w:ascii="Aptos" w:hAnsi="Aptos"/>
                 <w:sz w:val="24"/>
@@ -15070,7 +15193,6 @@
                 <w:szCs w:val="24"/>
               </w:rPr>
             </w:pPr>
-            <w:proofErr w:type="spellStart"/>
             <w:r>
               <w:rPr>
                 <w:rFonts w:ascii="Aptos" w:hAnsi="Aptos"/>
@@ -15079,7 +15201,6 @@
               </w:rPr>
               <w:t>Khadiatou</w:t>
             </w:r>
-            <w:proofErr w:type="spellEnd"/>
           </w:p>
         </w:tc>
         <w:tc>
@@ -15101,7 +15222,7 @@
                 <w:sz w:val="24"/>
                 <w:szCs w:val="24"/>
               </w:rPr>
-              <w:t>Responsable Documentation &amp; Qualité</w:t>
+              <w:t>Responsable Qualité &amp; Docker</w:t>
             </w:r>
           </w:p>
         </w:tc>
@@ -15111,7 +15232,6 @@
           </w:tcPr>
           <w:p>
             <w:pPr>
-              <w:jc w:val="both"/>
               <w:rPr>
                 <w:rFonts w:ascii="Aptos" w:hAnsi="Aptos"/>
                 <w:sz w:val="24"/>
@@ -15124,7 +15244,7 @@
                 <w:sz w:val="24"/>
                 <w:szCs w:val="24"/>
               </w:rPr>
-              <w:t xml:space="preserve">Rédaction du document de cadrage, suivi du planning, cahier de recette et conformité, </w:t>
+              <w:t>Pilotage de la documentation, conformité des livrables et déploiement des conteneurs.</w:t>
             </w:r>
           </w:p>
         </w:tc>
@@ -15177,6 +15297,7 @@
           <w:sz w:val="24"/>
           <w:szCs w:val="24"/>
         </w:rPr>
+        <w:lastRenderedPageBreak/>
         <w:t>Planning prévisionnel :</w:t>
       </w:r>
       <w:bookmarkEnd w:id="38"/>
@@ -15293,7 +15414,6 @@
           <w:sz w:val="24"/>
           <w:szCs w:val="24"/>
         </w:rPr>
-        <w:lastRenderedPageBreak/>
         <w:drawing>
           <wp:inline distT="0" distB="0" distL="0" distR="0" wp14:anchorId="6BE61739" wp14:editId="7515E23C">
             <wp:extent cx="5760720" cy="2221230"/>
@@ -15361,6 +15481,7 @@
           <w:sz w:val="24"/>
           <w:szCs w:val="24"/>
         </w:rPr>
+        <w:lastRenderedPageBreak/>
         <w:drawing>
           <wp:inline distT="0" distB="0" distL="0" distR="0" wp14:anchorId="639513CD" wp14:editId="692590FD">
             <wp:extent cx="5760720" cy="1829435"/>
@@ -16082,7 +16203,6 @@
           </w:tcPr>
           <w:p>
             <w:pPr>
-              <w:jc w:val="both"/>
               <w:rPr>
                 <w:rFonts w:ascii="Aptos" w:hAnsi="Aptos"/>
                 <w:sz w:val="24"/>
@@ -16156,7 +16276,6 @@
           </w:tcPr>
           <w:p>
             <w:pPr>
-              <w:jc w:val="both"/>
               <w:rPr>
                 <w:rFonts w:ascii="Aptos" w:hAnsi="Aptos"/>
                 <w:sz w:val="24"/>
@@ -16230,7 +16349,6 @@
           </w:tcPr>
           <w:p>
             <w:pPr>
-              <w:jc w:val="both"/>
               <w:rPr>
                 <w:rFonts w:ascii="Aptos" w:hAnsi="Aptos"/>
                 <w:sz w:val="24"/>
@@ -16304,7 +16422,6 @@
           </w:tcPr>
           <w:p>
             <w:pPr>
-              <w:jc w:val="both"/>
               <w:rPr>
                 <w:rFonts w:ascii="Aptos" w:hAnsi="Aptos"/>
                 <w:sz w:val="24"/>
@@ -16945,7 +17062,7 @@
             <w:jc w:val="right"/>
           </w:pPr>
           <w:r>
-            <w:object w:dxaOrig="1287" w:dyaOrig="837" w14:anchorId="2F969CA1">
+            <w:object w:dxaOrig="1520" w:dyaOrig="987" w14:anchorId="2F969CA1">
               <v:shapetype id="_x0000_t75" coordsize="21600,21600" o:spt="75" o:preferrelative="t" path="m@4@5l@4@11@9@11@9@5xe" filled="f" stroked="f">
                 <v:stroke joinstyle="miter"/>
                 <v:formulas>
@@ -16965,10 +17082,10 @@
                 <v:path o:extrusionok="f" gradientshapeok="t" o:connecttype="rect"/>
                 <o:lock v:ext="edit" aspectratio="t"/>
               </v:shapetype>
-              <v:shape id="_x0000_i1025" type="#_x0000_t75" style="width:75.6pt;height:49.8pt">
+              <v:shape id="_x0000_i1025" type="#_x0000_t75" style="width:75.8pt;height:49.65pt">
                 <v:imagedata r:id="rId5" o:title=""/>
               </v:shape>
-              <o:OLEObject Type="Embed" ProgID="Package" ShapeID="_x0000_i1025" DrawAspect="Icon" ObjectID="_1838285877" r:id="rId6"/>
+              <o:OLEObject Type="Embed" ProgID="Package" ShapeID="_x0000_i1025" DrawAspect="Icon" ObjectID="_1838355436" r:id="rId6"/>
             </w:object>
           </w:r>
         </w:p>
@@ -22306,7 +22423,6 @@
   <w:style w:type="character" w:default="1" w:styleId="Policepardfaut">
     <w:name w:val="Default Paragraph Font"/>
     <w:uiPriority w:val="1"/>
-    <w:semiHidden/>
     <w:unhideWhenUsed/>
   </w:style>
   <w:style w:type="table" w:default="1" w:styleId="TableauNormal">
@@ -23529,6 +23645,10 @@
 </file>
 
 <file path=customXml/item1.xml><?xml version="1.0" encoding="utf-8"?>
+<b:Sources xmlns:b="http://schemas.openxmlformats.org/officeDocument/2006/bibliography" xmlns="http://schemas.openxmlformats.org/officeDocument/2006/bibliography" SelectedStyle="\APASixthEditionOfficeOnline.xsl" StyleName="APA" Version="6"/>
+</file>
+
+<file path=customXml/item2.xml><?xml version="1.0" encoding="utf-8"?>
 <ct:contentTypeSchema xmlns:ct="http://schemas.microsoft.com/office/2006/metadata/contentType" xmlns:ma="http://schemas.microsoft.com/office/2006/metadata/properties/metaAttributes" ct:_="" ma:_="" ma:contentTypeName="Document" ma:contentTypeID="0x01010079F111ED35F8CC479449609E8A0923A6" ma:contentTypeVersion="11" ma:contentTypeDescription="Create a new document." ma:contentTypeScope="" ma:versionID="1c2eb7a32e66fb6e4260f3771546a5e2">
   <xsd:schema xmlns:xsd="http://www.w3.org/2001/XMLSchema" xmlns:xs="http://www.w3.org/2001/XMLSchema" xmlns:p="http://schemas.microsoft.com/office/2006/metadata/properties" xmlns:ns2="71af3243-3dd4-4a8d-8c0d-dd76da1f02a5" xmlns:ns3="16c05727-aa75-4e4a-9b5f-8a80a1165891" targetNamespace="http://schemas.microsoft.com/office/2006/metadata/properties" ma:root="true" ma:fieldsID="04e1f6479c48b08974ba73b5ca973489" ns2:_="" ns3:_="">
     <xsd:import namespace="71af3243-3dd4-4a8d-8c0d-dd76da1f02a5"/>
@@ -23739,19 +23859,7 @@
 </ct:contentTypeSchema>
 </file>
 
-<file path=customXml/item2.xml><?xml version="1.0" encoding="utf-8"?>
-<b:Sources xmlns:b="http://schemas.openxmlformats.org/officeDocument/2006/bibliography" xmlns="http://schemas.openxmlformats.org/officeDocument/2006/bibliography" SelectedStyle="\APASixthEditionOfficeOnline.xsl" StyleName="APA" Version="6"/>
-</file>
-
 <file path=customXml/item3.xml><?xml version="1.0" encoding="utf-8"?>
-<p:properties xmlns:p="http://schemas.microsoft.com/office/2006/metadata/properties" xmlns:xsi="http://www.w3.org/2001/XMLSchema-instance" xmlns:pc="http://schemas.microsoft.com/office/infopath/2007/PartnerControls">
-  <documentManagement>
-    <MediaServiceKeyPoints xmlns="71af3243-3dd4-4a8d-8c0d-dd76da1f02a5" xsi:nil="true"/>
-  </documentManagement>
-</p:properties>
-</file>
-
-<file path=customXml/item4.xml><?xml version="1.0" encoding="utf-8"?>
 <?mso-contentType ?>
 <FormTemplates xmlns="http://schemas.microsoft.com/sharepoint/v3/contenttype/forms">
   <Display>DocumentLibraryForm</Display>
@@ -23760,7 +23868,23 @@
 </FormTemplates>
 </file>
 
+<file path=customXml/item4.xml><?xml version="1.0" encoding="utf-8"?>
+<p:properties xmlns:p="http://schemas.microsoft.com/office/2006/metadata/properties" xmlns:xsi="http://www.w3.org/2001/XMLSchema-instance" xmlns:pc="http://schemas.microsoft.com/office/infopath/2007/PartnerControls">
+  <documentManagement>
+    <MediaServiceKeyPoints xmlns="71af3243-3dd4-4a8d-8c0d-dd76da1f02a5" xsi:nil="true"/>
+  </documentManagement>
+</p:properties>
+</file>
+
 <file path=customXml/itemProps1.xml><?xml version="1.0" encoding="utf-8"?>
+<ds:datastoreItem xmlns:ds="http://schemas.openxmlformats.org/officeDocument/2006/customXml" ds:itemID="{3AD27755-CC49-49BF-9008-1AE1D533B076}">
+  <ds:schemaRefs>
+    <ds:schemaRef ds:uri="http://schemas.openxmlformats.org/officeDocument/2006/bibliography"/>
+  </ds:schemaRefs>
+</ds:datastoreItem>
+</file>
+
+<file path=customXml/itemProps2.xml><?xml version="1.0" encoding="utf-8"?>
 <ds:datastoreItem xmlns:ds="http://schemas.openxmlformats.org/officeDocument/2006/customXml" ds:itemID="{60F05BAD-32CA-4C1E-8250-99368520ED35}">
   <ds:schemaRefs>
     <ds:schemaRef ds:uri="http://schemas.microsoft.com/office/2006/metadata/contentType"/>
@@ -23779,15 +23903,15 @@
 </ds:datastoreItem>
 </file>
 
-<file path=customXml/itemProps2.xml><?xml version="1.0" encoding="utf-8"?>
-<ds:datastoreItem xmlns:ds="http://schemas.openxmlformats.org/officeDocument/2006/customXml" ds:itemID="{3AD27755-CC49-49BF-9008-1AE1D533B076}">
+<file path=customXml/itemProps3.xml><?xml version="1.0" encoding="utf-8"?>
+<ds:datastoreItem xmlns:ds="http://schemas.openxmlformats.org/officeDocument/2006/customXml" ds:itemID="{C7C9CA62-B1A6-4BB3-9F94-B633F127DF74}">
   <ds:schemaRefs>
-    <ds:schemaRef ds:uri="http://schemas.openxmlformats.org/officeDocument/2006/bibliography"/>
+    <ds:schemaRef ds:uri="http://schemas.microsoft.com/sharepoint/v3/contenttype/forms"/>
   </ds:schemaRefs>
 </ds:datastoreItem>
 </file>
 
-<file path=customXml/itemProps3.xml><?xml version="1.0" encoding="utf-8"?>
+<file path=customXml/itemProps4.xml><?xml version="1.0" encoding="utf-8"?>
 <ds:datastoreItem xmlns:ds="http://schemas.openxmlformats.org/officeDocument/2006/customXml" ds:itemID="{ABEBC3F5-DCAB-4CF1-BFFC-D30075A4106F}">
   <ds:schemaRefs>
     <ds:schemaRef ds:uri="http://schemas.microsoft.com/office/2006/metadata/properties"/>
@@ -23795,12 +23919,4 @@
     <ds:schemaRef ds:uri="71af3243-3dd4-4a8d-8c0d-dd76da1f02a5"/>
   </ds:schemaRefs>
 </ds:datastoreItem>
-</file>
-
-<file path=customXml/itemProps4.xml><?xml version="1.0" encoding="utf-8"?>
-<ds:datastoreItem xmlns:ds="http://schemas.openxmlformats.org/officeDocument/2006/customXml" ds:itemID="{C7C9CA62-B1A6-4BB3-9F94-B633F127DF74}">
-  <ds:schemaRefs>
-    <ds:schemaRef ds:uri="http://schemas.microsoft.com/sharepoint/v3/contenttype/forms"/>
-  </ds:schemaRefs>
-</ds:datastoreItem>
 </file>
</xml_diff>